<commit_message>
Add Linux execution screenshots
</commit_message>
<xml_diff>
--- a/Lab02_Linux/lab02-report.docx
+++ b/Lab02_Linux/lab02-report.docx
@@ -904,6 +904,341 @@
         <w:t>screenshots/stage-01.png ... screenshots/stage-07.png.</w:t>
       </w:r>
     </w:p>
+    <w:p>
+      <w:pPr>
+        <w:spacing w:before="240"/>
+      </w:pPr>
+      <w:r>
+        <w:rPr>
+          <w:rFonts w:ascii="Times New Roman" w:hAnsi="Times New Roman" w:eastAsia="Times New Roman"/>
+          <w:b/>
+          <w:sz w:val="32"/>
+        </w:rPr>
+        <w:t>Скріншоти виконання</w:t>
+      </w:r>
+    </w:p>
+    <w:p>
+      <w:r>
+        <w:rPr>
+          <w:rFonts w:ascii="Times New Roman" w:hAnsi="Times New Roman"/>
+          <w:b/>
+          <w:sz w:val="28"/>
+        </w:rPr>
+        <w:t>Етап 1</w:t>
+      </w:r>
+    </w:p>
+    <w:p>
+      <w:r>
+        <w:drawing>
+          <wp:inline xmlns:a="http://schemas.openxmlformats.org/drawingml/2006/main" xmlns:pic="http://schemas.openxmlformats.org/drawingml/2006/picture">
+            <wp:extent cx="5400000" cy="3375000"/>
+            <wp:docPr id="1" name="Picture 1"/>
+            <wp:cNvGraphicFramePr>
+              <a:graphicFrameLocks noChangeAspect="1"/>
+            </wp:cNvGraphicFramePr>
+            <a:graphic>
+              <a:graphicData uri="http://schemas.openxmlformats.org/drawingml/2006/picture">
+                <pic:pic>
+                  <pic:nvPicPr>
+                    <pic:cNvPr id="0" name="stage-01.png"/>
+                    <pic:cNvPicPr/>
+                  </pic:nvPicPr>
+                  <pic:blipFill>
+                    <a:blip r:embed="rId9"/>
+                    <a:stretch>
+                      <a:fillRect/>
+                    </a:stretch>
+                  </pic:blipFill>
+                  <pic:spPr>
+                    <a:xfrm>
+                      <a:off x="0" y="0"/>
+                      <a:ext cx="5400000" cy="3375000"/>
+                    </a:xfrm>
+                    <a:prstGeom prst="rect"/>
+                  </pic:spPr>
+                </pic:pic>
+              </a:graphicData>
+            </a:graphic>
+          </wp:inline>
+        </w:drawing>
+      </w:r>
+    </w:p>
+    <w:p>
+      <w:r>
+        <w:rPr>
+          <w:rFonts w:ascii="Times New Roman" w:hAnsi="Times New Roman"/>
+          <w:b/>
+          <w:sz w:val="28"/>
+        </w:rPr>
+        <w:t>Етап 2</w:t>
+      </w:r>
+    </w:p>
+    <w:p>
+      <w:r>
+        <w:drawing>
+          <wp:inline xmlns:a="http://schemas.openxmlformats.org/drawingml/2006/main" xmlns:pic="http://schemas.openxmlformats.org/drawingml/2006/picture">
+            <wp:extent cx="5400000" cy="3375000"/>
+            <wp:docPr id="2" name="Picture 2"/>
+            <wp:cNvGraphicFramePr>
+              <a:graphicFrameLocks noChangeAspect="1"/>
+            </wp:cNvGraphicFramePr>
+            <a:graphic>
+              <a:graphicData uri="http://schemas.openxmlformats.org/drawingml/2006/picture">
+                <pic:pic>
+                  <pic:nvPicPr>
+                    <pic:cNvPr id="0" name="stage-02.png"/>
+                    <pic:cNvPicPr/>
+                  </pic:nvPicPr>
+                  <pic:blipFill>
+                    <a:blip r:embed="rId10"/>
+                    <a:stretch>
+                      <a:fillRect/>
+                    </a:stretch>
+                  </pic:blipFill>
+                  <pic:spPr>
+                    <a:xfrm>
+                      <a:off x="0" y="0"/>
+                      <a:ext cx="5400000" cy="3375000"/>
+                    </a:xfrm>
+                    <a:prstGeom prst="rect"/>
+                  </pic:spPr>
+                </pic:pic>
+              </a:graphicData>
+            </a:graphic>
+          </wp:inline>
+        </w:drawing>
+      </w:r>
+    </w:p>
+    <w:p>
+      <w:r>
+        <w:rPr>
+          <w:rFonts w:ascii="Times New Roman" w:hAnsi="Times New Roman"/>
+          <w:b/>
+          <w:sz w:val="28"/>
+        </w:rPr>
+        <w:t>Етап 3</w:t>
+      </w:r>
+    </w:p>
+    <w:p>
+      <w:r>
+        <w:drawing>
+          <wp:inline xmlns:a="http://schemas.openxmlformats.org/drawingml/2006/main" xmlns:pic="http://schemas.openxmlformats.org/drawingml/2006/picture">
+            <wp:extent cx="5400000" cy="3375000"/>
+            <wp:docPr id="3" name="Picture 3"/>
+            <wp:cNvGraphicFramePr>
+              <a:graphicFrameLocks noChangeAspect="1"/>
+            </wp:cNvGraphicFramePr>
+            <a:graphic>
+              <a:graphicData uri="http://schemas.openxmlformats.org/drawingml/2006/picture">
+                <pic:pic>
+                  <pic:nvPicPr>
+                    <pic:cNvPr id="0" name="stage-03.png"/>
+                    <pic:cNvPicPr/>
+                  </pic:nvPicPr>
+                  <pic:blipFill>
+                    <a:blip r:embed="rId11"/>
+                    <a:stretch>
+                      <a:fillRect/>
+                    </a:stretch>
+                  </pic:blipFill>
+                  <pic:spPr>
+                    <a:xfrm>
+                      <a:off x="0" y="0"/>
+                      <a:ext cx="5400000" cy="3375000"/>
+                    </a:xfrm>
+                    <a:prstGeom prst="rect"/>
+                  </pic:spPr>
+                </pic:pic>
+              </a:graphicData>
+            </a:graphic>
+          </wp:inline>
+        </w:drawing>
+      </w:r>
+    </w:p>
+    <w:p>
+      <w:r>
+        <w:rPr>
+          <w:rFonts w:ascii="Times New Roman" w:hAnsi="Times New Roman"/>
+          <w:b/>
+          <w:sz w:val="28"/>
+        </w:rPr>
+        <w:t>Етап 4</w:t>
+      </w:r>
+    </w:p>
+    <w:p>
+      <w:r>
+        <w:drawing>
+          <wp:inline xmlns:a="http://schemas.openxmlformats.org/drawingml/2006/main" xmlns:pic="http://schemas.openxmlformats.org/drawingml/2006/picture">
+            <wp:extent cx="5400000" cy="3375000"/>
+            <wp:docPr id="4" name="Picture 4"/>
+            <wp:cNvGraphicFramePr>
+              <a:graphicFrameLocks noChangeAspect="1"/>
+            </wp:cNvGraphicFramePr>
+            <a:graphic>
+              <a:graphicData uri="http://schemas.openxmlformats.org/drawingml/2006/picture">
+                <pic:pic>
+                  <pic:nvPicPr>
+                    <pic:cNvPr id="0" name="stage-04.png"/>
+                    <pic:cNvPicPr/>
+                  </pic:nvPicPr>
+                  <pic:blipFill>
+                    <a:blip r:embed="rId12"/>
+                    <a:stretch>
+                      <a:fillRect/>
+                    </a:stretch>
+                  </pic:blipFill>
+                  <pic:spPr>
+                    <a:xfrm>
+                      <a:off x="0" y="0"/>
+                      <a:ext cx="5400000" cy="3375000"/>
+                    </a:xfrm>
+                    <a:prstGeom prst="rect"/>
+                  </pic:spPr>
+                </pic:pic>
+              </a:graphicData>
+            </a:graphic>
+          </wp:inline>
+        </w:drawing>
+      </w:r>
+    </w:p>
+    <w:p>
+      <w:r>
+        <w:rPr>
+          <w:rFonts w:ascii="Times New Roman" w:hAnsi="Times New Roman"/>
+          <w:b/>
+          <w:sz w:val="28"/>
+        </w:rPr>
+        <w:t>Етап 5</w:t>
+      </w:r>
+    </w:p>
+    <w:p>
+      <w:r>
+        <w:drawing>
+          <wp:inline xmlns:a="http://schemas.openxmlformats.org/drawingml/2006/main" xmlns:pic="http://schemas.openxmlformats.org/drawingml/2006/picture">
+            <wp:extent cx="5400000" cy="3375000"/>
+            <wp:docPr id="5" name="Picture 5"/>
+            <wp:cNvGraphicFramePr>
+              <a:graphicFrameLocks noChangeAspect="1"/>
+            </wp:cNvGraphicFramePr>
+            <a:graphic>
+              <a:graphicData uri="http://schemas.openxmlformats.org/drawingml/2006/picture">
+                <pic:pic>
+                  <pic:nvPicPr>
+                    <pic:cNvPr id="0" name="stage-05.png"/>
+                    <pic:cNvPicPr/>
+                  </pic:nvPicPr>
+                  <pic:blipFill>
+                    <a:blip r:embed="rId13"/>
+                    <a:stretch>
+                      <a:fillRect/>
+                    </a:stretch>
+                  </pic:blipFill>
+                  <pic:spPr>
+                    <a:xfrm>
+                      <a:off x="0" y="0"/>
+                      <a:ext cx="5400000" cy="3375000"/>
+                    </a:xfrm>
+                    <a:prstGeom prst="rect"/>
+                  </pic:spPr>
+                </pic:pic>
+              </a:graphicData>
+            </a:graphic>
+          </wp:inline>
+        </w:drawing>
+      </w:r>
+    </w:p>
+    <w:p>
+      <w:r>
+        <w:rPr>
+          <w:rFonts w:ascii="Times New Roman" w:hAnsi="Times New Roman"/>
+          <w:b/>
+          <w:sz w:val="28"/>
+        </w:rPr>
+        <w:t>Етап 6</w:t>
+      </w:r>
+    </w:p>
+    <w:p>
+      <w:r>
+        <w:drawing>
+          <wp:inline xmlns:a="http://schemas.openxmlformats.org/drawingml/2006/main" xmlns:pic="http://schemas.openxmlformats.org/drawingml/2006/picture">
+            <wp:extent cx="5400000" cy="3375000"/>
+            <wp:docPr id="6" name="Picture 6"/>
+            <wp:cNvGraphicFramePr>
+              <a:graphicFrameLocks noChangeAspect="1"/>
+            </wp:cNvGraphicFramePr>
+            <a:graphic>
+              <a:graphicData uri="http://schemas.openxmlformats.org/drawingml/2006/picture">
+                <pic:pic>
+                  <pic:nvPicPr>
+                    <pic:cNvPr id="0" name="stage-06.png"/>
+                    <pic:cNvPicPr/>
+                  </pic:nvPicPr>
+                  <pic:blipFill>
+                    <a:blip r:embed="rId14"/>
+                    <a:stretch>
+                      <a:fillRect/>
+                    </a:stretch>
+                  </pic:blipFill>
+                  <pic:spPr>
+                    <a:xfrm>
+                      <a:off x="0" y="0"/>
+                      <a:ext cx="5400000" cy="3375000"/>
+                    </a:xfrm>
+                    <a:prstGeom prst="rect"/>
+                  </pic:spPr>
+                </pic:pic>
+              </a:graphicData>
+            </a:graphic>
+          </wp:inline>
+        </w:drawing>
+      </w:r>
+    </w:p>
+    <w:p>
+      <w:r>
+        <w:rPr>
+          <w:rFonts w:ascii="Times New Roman" w:hAnsi="Times New Roman"/>
+          <w:b/>
+          <w:sz w:val="28"/>
+        </w:rPr>
+        <w:t>Етап 7</w:t>
+      </w:r>
+    </w:p>
+    <w:p>
+      <w:r>
+        <w:drawing>
+          <wp:inline xmlns:a="http://schemas.openxmlformats.org/drawingml/2006/main" xmlns:pic="http://schemas.openxmlformats.org/drawingml/2006/picture">
+            <wp:extent cx="5400000" cy="3375000"/>
+            <wp:docPr id="7" name="Picture 7"/>
+            <wp:cNvGraphicFramePr>
+              <a:graphicFrameLocks noChangeAspect="1"/>
+            </wp:cNvGraphicFramePr>
+            <a:graphic>
+              <a:graphicData uri="http://schemas.openxmlformats.org/drawingml/2006/picture">
+                <pic:pic>
+                  <pic:nvPicPr>
+                    <pic:cNvPr id="0" name="stage-07.png"/>
+                    <pic:cNvPicPr/>
+                  </pic:nvPicPr>
+                  <pic:blipFill>
+                    <a:blip r:embed="rId15"/>
+                    <a:stretch>
+                      <a:fillRect/>
+                    </a:stretch>
+                  </pic:blipFill>
+                  <pic:spPr>
+                    <a:xfrm>
+                      <a:off x="0" y="0"/>
+                      <a:ext cx="5400000" cy="3375000"/>
+                    </a:xfrm>
+                    <a:prstGeom prst="rect"/>
+                  </pic:spPr>
+                </pic:pic>
+              </a:graphicData>
+            </a:graphic>
+          </wp:inline>
+        </w:drawing>
+      </w:r>
+    </w:p>
     <w:sectPr>
       <w:pgSz w:w="12240" w:h="15840"/>
       <w:pgMar w:top="1134" w:right="850" w:bottom="1134" w:left="1701" w:header="720" w:footer="720" w:gutter="0"/>

</xml_diff>